<commit_message>
diferenciador a pulsera inteligente
</commit_message>
<xml_diff>
--- a/Fase 1/Evidencias Grupales/1.5_GuiaEstudiante_Fase1_DefinicionProyectoAPT_PerfilMedico.docx
+++ b/Fase 1/Evidencias Grupales/1.5_GuiaEstudiante_Fase1_DefinicionProyectoAPT_PerfilMedico.docx
@@ -1535,12 +1535,35 @@
                 <w:szCs w:val="22"/>
                 <w:rtl w:val="0"/>
               </w:rPr>
-              <w:t xml:space="preserve">Muchas familias gestionan las horas médicas, tratamientos, medicamentos, controles y antecedentes de salud de forma manual o repartida entre múltiples herramientas no integradas (papeles, fotografías de recetas, calendarios, WhatsApp, alarmas del teléfono). Esta dispersión genera desorganización, pérdida de información y dificulta el seguimiento adecuado de las indicaciones de salud, especialmente en adultos mayores, personas con enfermedades crónicas y personas que requieren apoyo permanente, así como en los familiares que cumplen el rol de cuidadores y no siempre pueden estar físicamente presentes. La situación se sitúa en el contexto de familias de la Región Metropolitana de Chile e impacta principalmente a adultos mayores, pacientes crónicos y a sus cuidadores.</w:t>
-            </w:r>
-            <w:r>
-              <w:rPr>
-                <w:rtl w:val="0"/>
-              </w:rPr>
+              <w:t>Muchas familias gestionan las horas médicas, tratamientos, medicamentos, controles y antecedentes de salud de forma manual o repartida entre múltiples herramientas no integradas (papeles, fotografías de recetas, calendarios, WhatsApp, alarmas del teléfono). Esta dispersión genera desorganización, pérdida de información y dificulta el seguimiento adecuado de las indicaciones de salud, especialmente en adultos mayores, personas con enfermedades crónicas y personas que requieren apoyo permanente, así como en los familiares que cumplen el rol de cuidadores y no siempre pueden estar físicamente presentes. La situación se sitúa en el contexto de familias de la Región Metropolitana de Chile e impacta principalmente a adultos mayores, perfiles dependientes con enfermedades crónicas y a sus cuidadores.</w:t>
+            </w:r>
+            <w:r>
+              <w:rPr>
+                <w:rtl w:val="0"/>
+              </w:rPr>
+            </w:r>
+          </w:p>
+          <w:p>
+            <w:pPr>
+              <w:jc w:val="left"/>
+            </w:pPr>
+            <w:r>
+              <w:rPr>
+                <w:b/>
+                <w:sz w:val="22"/>
+              </w:rPr>
+              <w:t>Modelo de negocio (proyección a futuro):</w:t>
+            </w:r>
+          </w:p>
+          <w:p>
+            <w:pPr>
+              <w:jc w:val="left"/>
+            </w:pPr>
+            <w:r>
+              <w:rPr>
+                <w:sz w:val="22"/>
+              </w:rPr>
+              <w:t>Se proyecta un modelo freemium: un plan Gratis (1 perfil, recordatorios básicos y confirmación manual) y un plan Perfil Médico+ Premium ($2.990-$3.990 CLP mensual o $24.990-$29.990 CLP anual) que desbloquea perfiles dependientes ilimitados, la pulsera inteligente conectada, alertas escalonadas al cuidador, historial completo y reportes para el médico, y el módulo de IA (orientación general y búsqueda de farmacias). El plan pagado se activa naturalmente en el momento de mayor necesidad percibida: cuando el usuario quiere agregar a un familiar a su cargo.</w:t>
             </w:r>
           </w:p>
         </w:tc>
@@ -1607,7 +1630,7 @@
                 <w:b/>
                 <w:sz w:val="22"/>
               </w:rPr>
-              <w:t>Mecanismo de monitoreo para perfiles dependientes y/o no valentes:</w:t>
+              <w:t>Diferenciador: Pulsera Inteligente Perfil Médico+</w:t>
             </w:r>
           </w:p>
           <w:p>
@@ -1619,7 +1642,7 @@
                 <w:b w:val="0"/>
                 <w:sz w:val="22"/>
               </w:rPr>
-              <w:t>El sistema no puede verificar físicamente que una persona se administró un medicamento o se hidrató (eso requeriría sensores o dispositivos externos, fuera del alcance de este proyecto). Por eso el monitoreo se implementa mediante un mecanismo de confirmación reportada, de la misma forma en que operan aplicaciones de salud existentes en el mercado (ej. Medisafe, MyTherapy). El detalle paso a paso es el siguiente:</w:t>
+              <w:t>Perfil Médico+ se integra con una pulsera inteligente ya disponible en el mercado (sin fabricar hardware propio), pensada para los dos tipos de perfiles dependientes que atiende el proyecto — adultos mayores no valentes y niños — bajo la supervisión de un adulto responsable. La pulsera aporta:</w:t>
             </w:r>
           </w:p>
           <w:p>
@@ -1631,7 +1654,7 @@
                 <w:b w:val="0"/>
                 <w:sz w:val="22"/>
               </w:rPr>
-              <w:t>1. Planificar: el titular o un cuidador autorizado configura, para cada perfil dependiente, una rutina de cuidado que especifica qué (ej. Losartán), cuánto (dosis, ej. 50 mg, 1 comprimido) y cuándo (horario y frecuencia, ej. 08:00 y 20:00).</w:t>
+              <w:t>• Ubicación y salud: GPS con geocercas (alerta si el niño no llega al colegio o el adulto mayor sale de una zona segura), frecuencia cardíaca vía Health Connect, y presión arterial referencial (no reemplaza un tensiómetro médico).</w:t>
             </w:r>
           </w:p>
           <w:p>
@@ -1643,7 +1666,19 @@
                 <w:b w:val="0"/>
                 <w:sz w:val="22"/>
               </w:rPr>
-              <w:t>2. Recordar: en el horario programado, el sistema envía una notificación push al perfil correspondiente recordando la actividad pendiente.</w:t>
+              <w:t>• Seguridad: detección automática de caídas, botón SOS físico, alerta de batería baja del dispositivo, y detección de inactividad inusual a partir de los datos de movimiento.</w:t>
+            </w:r>
+          </w:p>
+          <w:p>
+            <w:pPr>
+              <w:jc w:val="left"/>
+            </w:pPr>
+            <w:r>
+              <w:rPr>
+                <w:b/>
+                <w:sz w:val="22"/>
+              </w:rPr>
+              <w:t>Otras funcionalidades nuevas incorporadas a la app:</w:t>
             </w:r>
           </w:p>
           <w:p>
@@ -1655,7 +1690,7 @@
                 <w:b w:val="0"/>
                 <w:sz w:val="22"/>
               </w:rPr>
-              <w:t>3. Confirmar: si la persona dependiente puede usar la aplicación, confirma la actividad directamente (ej. "Ya lo tomé"). Si no puede o no sabe usar la app —el caso más frecuente en adultos mayores con baja alfabetización digital—, el cuidador confirma en su nombre desde su propio perfil, quedando registrado como confirmación por proxy. La dosis y el medicamento no se reingresan cada vez: quedan fijados al crear la rutina, y solo se confirma su cumplimiento, reduciendo el margen de error humano en el registro.</w:t>
+              <w:t>• Registro manual de glucosa: el cuidador ingresa la lectura de un glucómetro certificado. No se mide de forma automática por seguridad — la FDA advirtió en 2024 que ningún smartwatch o anillo inteligente está aprobado para medir glucosa sin pinchazo, y que confiar en esa medición puede derivar en errores de dosis de insulina.</w:t>
             </w:r>
           </w:p>
           <w:p>
@@ -1667,7 +1702,7 @@
                 <w:b w:val="0"/>
                 <w:sz w:val="22"/>
               </w:rPr>
-              <w:t>4. Monitorear: cada confirmación (o ausencia de ella) se guarda con marca de tiempo en la base de datos, construyendo un historial de cumplimiento por perfil dependiente (ej. porcentaje de dosis confirmadas en los últimos 7 días).</w:t>
+              <w:t>• Recordatorios extendidos: indicaciones posteriores a una consulta médica (ej. tomar algo horas después de ver a un especialista) y citas médicas pendientes, con recordatorio diario hasta la fecha.</w:t>
             </w:r>
           </w:p>
           <w:p>
@@ -1679,42 +1714,7 @@
                 <w:b w:val="0"/>
                 <w:sz w:val="22"/>
               </w:rPr>
-              <w:t>5. Alertar: si transcurre un tiempo de tolerancia (ej. 30-60 minutos) sin confirmación, el sistema escala el aviso: primero un segundo recordatorio al propio perfil y, si continúa sin respuesta, una notificación al cuidador autorizado.</w:t>
-            </w:r>
-          </w:p>
-          <w:p>
-            <w:pPr>
-              <w:jc w:val="left"/>
-            </w:pPr>
-            <w:r>
-              <w:rPr>
-                <w:b w:val="0"/>
-                <w:sz w:val="22"/>
-              </w:rPr>
-              <w:t>6. Acompañar: el cuidador visualiza, desde su propia cuenta, un resumen del estado de cumplimiento de todos los perfiles dependientes a su cargo (ej. "hidratación: 3/4 hoy", "medicamento de las 20:00: pendiente"), sin necesidad de estar físicamente presente para saber si la persona a su cargo está cumpliendo su rutina de cuidado.</w:t>
-            </w:r>
-          </w:p>
-          <w:p>
-            <w:pPr>
-              <w:jc w:val="left"/>
-            </w:pPr>
-            <w:r>
-              <w:rPr>
-                <w:b/>
-                <w:sz w:val="22"/>
-              </w:rPr>
-              <w:t>Elementos diferenciadores frente a soluciones similares:</w:t>
-            </w:r>
-          </w:p>
-          <w:p>
-            <w:pPr>
-              <w:jc w:val="left"/>
-            </w:pPr>
-            <w:r>
-              <w:rPr>
-                <w:sz w:val="22"/>
-              </w:rPr>
-              <w:t>Además del núcleo descrito, Perfil Médico+ incorpora tres funcionalidades que lo distinguen de aplicaciones de recordatorio de medicamentos genéricas: un modo "pantalla en casa" para tablets fijas pensado para adultos mayores que no manejan un smartphone, integración con pulseras inteligentes para mostrar signos vitales, y detección de sonidos fuertes en el hogar como señal temprana de una posible caída u otro incidente.</w:t>
+              <w:t>• Consulta a la IA sobre farmacias cercanas que tengan el medicamento buscado, comparando precio y cercanía — inspirado en herramientas públicas reales como TuFarmacia.gob.cl (MINSAL) y comparadores como BuscaFarma.</w:t>
             </w:r>
           </w:p>
         </w:tc>
@@ -1937,20 +1937,13 @@
                 <w:szCs w:val="20"/>
               </w:rPr>
             </w:pPr>
-            <w:r>
-              <w:rPr>
-                <w:i w:val="0"/>
-                <w:iCs w:val="0"/>
-                <w:sz w:val="22"/>
-                <w:szCs w:val="22"/>
-                <w:rtl w:val="0"/>
-              </w:rPr>
-              <w:t xml:space="preserve">El proyecto es factible de desarrollar considerando: (1) Duración del semestre: 18 semanas, con 11 semanas de desarrollo intensivo (Fase 2); (2) Horas asignadas: la asignatura CAPSTONE cuenta con 20 créditos (10 de trabajo docente y 10 de trabajo autónomo); (3) Materiales requeridos: equipos propios del equipo, herramientas y librerías de código abierto (Flutter, FastAPI, PostgreSQL, Docker), sin costos de licencias; (4) Factores externos que facilitan su desarrollo: el equipo ya maneja las tecnologías definidas y cuenta con roles claramente asignados por módulo; (5) Factores externos que podrían dificultar su desarrollo: la coordinación de horarios entre los tres integrantes y la curva de aprendizaje del módulo de inteligencia artificial; ambos se abordan mediante reuniones semanales fijas y dejando la IA como funcionalidad de menor prioridad dentro del backlog.</w:t>
-            </w:r>
-            <w:r>
-              <w:rPr>
-                <w:rtl w:val="0"/>
-              </w:rPr>
+            <w:r/>
+            <w:r>
+              <w:rPr>
+                <w:b w:val="0"/>
+                <w:sz w:val="22"/>
+              </w:rPr>
+              <w:t>El proyecto es factible de desarrollar considerando: (1) Duración del semestre: 18 semanas, con 11 semanas de desarrollo intensivo (Fase 2); (2) Horas asignadas: la asignatura CAPSTONE cuenta con 20 créditos (10 de trabajo docente y 10 de trabajo autónomo); (3) Materiales requeridos: equipos propios del equipo, herramientas y librerías de código abierto (Flutter, FastAPI, PostgreSQL, Docker), sin costos de licencias; (4) Factores externos que facilitan su desarrollo: el equipo ya maneja las tecnologías definidas y cuenta con roles claramente asignados por módulo; (5) Factores externos que podrían dificultar su desarrollo: la coordinación de horarios entre los tres integrantes y la curva de aprendizaje del módulo de inteligencia artificial; ambos se abordan mediante reuniones semanales fijas y dejando la IA como funcionalidad de menor prioridad dentro del backlog.</w:t>
             </w:r>
           </w:p>
           <w:p>
@@ -1962,18 +1955,19 @@
                 <w:b/>
                 <w:sz w:val="22"/>
               </w:rPr>
-              <w:t>Factibilidad de las funcionalidades diferenciadoras:</w:t>
-            </w:r>
-          </w:p>
-          <w:p>
-            <w:pPr>
-              <w:jc w:val="left"/>
-            </w:pPr>
-            <w:r>
-              <w:rPr>
-                <w:sz w:val="22"/>
-              </w:rPr>
-              <w:t>Estas tres funcionalidades se plantean como incrementos sobre el MVP base y se priorizarán según el avance del equipo durante la Fase 2, ya que se apoyan en tecnología de bajo costo y APIs gratuitas ya validadas: el modo "pantalla en casa" reutiliza la misma aplicación Flutter mediante Fully Kiosk Browser (gratuito) sobre una tablet Android económica; la integración de pulseras se realiza a través de Health Connect, la API gratuita y oficial de Android para datos de salud, sin necesidad de desarrollar hardware propio; y la detección de sonido utiliza el micrófono nativo del dispositivo, sin sensores adicionales. Ninguna de las tres requiere conocimientos de electrónica o fabricación de hardware, manteniéndose dentro del stack tecnológico ya declarado por el equipo.</w:t>
+              <w:t>Factibilidad de la pulsera inteligente y funciones nuevas:</w:t>
+            </w:r>
+          </w:p>
+          <w:p>
+            <w:pPr>
+              <w:jc w:val="left"/>
+            </w:pPr>
+            <w:r>
+              <w:rPr>
+                <w:b w:val="0"/>
+                <w:sz w:val="22"/>
+              </w:rPr>
+              <w:t>La pulsera se integra vía Health Connect (API gratuita y oficial de Android) y el SDK/app del fabricante para GPS y funciones de seguridad; no requiere desarrollar hardware propio ni conocimientos de electrónica. Costo de referencia: $70.000-$90.000 CLP el dispositivo, más un plan SIM prepago (~$5.000-$10.000 CLP mensuales) para la transmisión de ubicación en tiempo real. El registro manual de glucosa, los recordatorios extendidos y la consulta de farmacias son funcionalidades 100% de software, sin costo de hardware adicional. Estas funcionalidades se plantean como incrementos sobre el MVP base, a priorizar en Fase 2 según el avance del equipo.</w:t>
             </w:r>
           </w:p>
         </w:tc>
@@ -2404,29 +2398,51 @@
               <w:rPr>
                 <w:sz w:val="22"/>
               </w:rPr>
-              <w:t>7. Implementar un modo "pantalla en casa" de la aplicación, optimizado para tablets fijas, con botones grandes y confirmación simplificada pensada para el adulto mayor.</w:t>
-            </w:r>
-          </w:p>
-          <w:p>
-            <w:pPr>
-              <w:jc w:val="left"/>
-            </w:pPr>
-            <w:r>
-              <w:rPr>
-                <w:sz w:val="22"/>
-              </w:rPr>
-              <w:t>8. Integrar datos de dispositivos wearables (pulseras inteligentes) mediante Health Connect, mostrando indicadores de signos vitales dentro del perfil.</w:t>
-            </w:r>
-          </w:p>
-          <w:p>
-            <w:pPr>
-              <w:jc w:val="left"/>
-            </w:pPr>
-            <w:r>
-              <w:rPr>
-                <w:sz w:val="22"/>
-              </w:rPr>
-              <w:t>9. Incorporar detección de sonidos fuertes mediante el micrófono del dispositivo, generando una alerta al cuidador ante un posible incidente en el hogar.</w:t>
+              <w:t>7. Integrar una pulsera inteligente con GPS y geocercas para perfiles dependientes (adultos mayores no valentes y niños), mostrando también frecuencia cardíaca y presión arterial referencial.</w:t>
+            </w:r>
+          </w:p>
+          <w:p>
+            <w:pPr>
+              <w:jc w:val="left"/>
+            </w:pPr>
+            <w:r>
+              <w:rPr>
+                <w:sz w:val="22"/>
+              </w:rPr>
+              <w:t>8. Incorporar detección automática de caídas, botón SOS físico, alerta de batería baja e inactividad inusual desde la misma pulsera.</w:t>
+            </w:r>
+          </w:p>
+          <w:p>
+            <w:pPr>
+              <w:jc w:val="left"/>
+            </w:pPr>
+            <w:r>
+              <w:rPr>
+                <w:sz w:val="22"/>
+              </w:rPr>
+              <w:t>9. Permitir el registro manual de glucosa y otros parámetros médicos no medibles de forma segura por wearables, integrados al historial del perfil.</w:t>
+            </w:r>
+          </w:p>
+          <w:p>
+            <w:pPr>
+              <w:jc w:val="left"/>
+            </w:pPr>
+            <w:r>
+              <w:rPr>
+                <w:sz w:val="22"/>
+              </w:rPr>
+              <w:t>10. Extender el sistema de recordatorios para cubrir indicaciones posteriores a una consulta médica y citas médicas pendientes.</w:t>
+            </w:r>
+          </w:p>
+          <w:p>
+            <w:pPr>
+              <w:jc w:val="left"/>
+            </w:pPr>
+            <w:r>
+              <w:rPr>
+                <w:sz w:val="22"/>
+              </w:rPr>
+              <w:t>11. Integrar un módulo de IA que oriente sobre disponibilidad y precio de medicamentos en farmacias cercanas.</w:t>
             </w:r>
           </w:p>
         </w:tc>
@@ -7133,7 +7149,7 @@
               <w:rPr>
                 <w:sz w:val="20"/>
               </w:rPr>
-              <w:t>Modo pantalla en casa (tablet)</w:t>
+              <w:t>Pulsera: ubicación y salud</w:t>
             </w:r>
           </w:p>
         </w:tc>
@@ -7156,7 +7172,7 @@
               <w:rPr>
                 <w:sz w:val="20"/>
               </w:rPr>
-              <w:t>Vista alternativa de la app con botones grandes y confirmación simplificada, pensada para tablets fijas en el hogar del adulto mayor.</w:t>
+              <w:t>Integración de la pulsera inteligente vía GPS y Health Connect: geocercas, frecuencia cardíaca y presión referencial en el perfil.</w:t>
             </w:r>
           </w:p>
         </w:tc>
@@ -7179,7 +7195,7 @@
               <w:rPr>
                 <w:sz w:val="20"/>
               </w:rPr>
-              <w:t>Flutter, Fully Kiosk Browser, tablet Android</w:t>
+              <w:t>Health Connect API, SDK pulsera GPS</w:t>
             </w:r>
           </w:p>
         </w:tc>
@@ -7206,7 +7222,7 @@
               <w:rPr>
                 <w:sz w:val="20"/>
               </w:rPr>
-              <w:t>Semanas 13-14</w:t>
+              <w:t>Semana 13</w:t>
             </w:r>
           </w:p>
         </w:tc>
@@ -7234,7 +7250,7 @@
               <w:rPr>
                 <w:sz w:val="20"/>
               </w:rPr>
-              <w:t>Matías</w:t>
+              <w:t>Sergio / Benjamín</w:t>
             </w:r>
           </w:p>
         </w:tc>
@@ -7257,7 +7273,7 @@
               <w:rPr>
                 <w:sz w:val="20"/>
               </w:rPr>
-              <w:t>Facilitador: reutiliza la interfaz ya construida. Obstáculo: adaptar el diseño a pantallas de mayor tamaño.</w:t>
+              <w:t>Facilitador: Health Connect ya validado en Fase 1. Obstáculo: primera integración con un dispositivo GPS externo.</w:t>
             </w:r>
           </w:p>
         </w:tc>
@@ -7309,7 +7325,7 @@
               <w:rPr>
                 <w:sz w:val="20"/>
               </w:rPr>
-              <w:t>Integración con pulsera inteligente</w:t>
+              <w:t>Pulsera: funciones de seguridad</w:t>
             </w:r>
           </w:p>
         </w:tc>
@@ -7332,7 +7348,7 @@
               <w:rPr>
                 <w:sz w:val="20"/>
               </w:rPr>
-              <w:t>Lectura de frecuencia cardíaca y otros indicadores desde Health Connect para mostrarlos en el perfil de salud.</w:t>
+              <w:t>Lectura de eventos de caída, botón SOS, batería baja e inactividad inusual reportados por la pulsera, con alerta al cuidador.</w:t>
             </w:r>
           </w:p>
         </w:tc>
@@ -7355,7 +7371,7 @@
               <w:rPr>
                 <w:sz w:val="20"/>
               </w:rPr>
-              <w:t>Health Connect API, pulsera Xiaomi</w:t>
+              <w:t>SDK pulsera GPS, sistema de notificaciones</w:t>
             </w:r>
           </w:p>
         </w:tc>
@@ -7382,7 +7398,7 @@
               <w:rPr>
                 <w:sz w:val="20"/>
               </w:rPr>
-              <w:t>Semana 14</w:t>
+              <w:t>Semana 13</w:t>
             </w:r>
           </w:p>
         </w:tc>
@@ -7410,7 +7426,7 @@
               <w:rPr>
                 <w:sz w:val="20"/>
               </w:rPr>
-              <w:t>Sergio / Benjamín</w:t>
+              <w:t>Benjamín / Matías</w:t>
             </w:r>
           </w:p>
         </w:tc>
@@ -7433,7 +7449,7 @@
               <w:rPr>
                 <w:sz w:val="20"/>
               </w:rPr>
-              <w:t>Facilitador: API gratuita y documentada por Google. Obstáculo: primera vez integrando datos de wearables.</w:t>
+              <w:t>Facilitador: reutiliza el sistema de alertas ya construido. Obstáculo: distinguir falsos positivos de caída.</w:t>
             </w:r>
           </w:p>
         </w:tc>
@@ -7462,7 +7478,7 @@
               <w:rPr>
                 <w:sz w:val="20"/>
               </w:rPr>
-              <w:t>C4</w:t>
+              <w:t>C2</w:t>
             </w:r>
           </w:p>
         </w:tc>
@@ -7485,7 +7501,7 @@
               <w:rPr>
                 <w:sz w:val="20"/>
               </w:rPr>
-              <w:t>Detección de ruido fuerte</w:t>
+              <w:t>Registro manual de glucosa</w:t>
             </w:r>
           </w:p>
         </w:tc>
@@ -7508,7 +7524,7 @@
               <w:rPr>
                 <w:sz w:val="20"/>
               </w:rPr>
-              <w:t>Monitoreo del micrófono del dispositivo para detectar sonidos fuertes y generar una alerta automática al cuidador.</w:t>
+              <w:t>Formulario para que el cuidador ingrese lecturas de un glucómetro certificado, con historial y alertas por rango.</w:t>
             </w:r>
           </w:p>
         </w:tc>
@@ -7531,7 +7547,7 @@
               <w:rPr>
                 <w:sz w:val="20"/>
               </w:rPr>
-              <w:t>Flutter (noise_meter), micrófono nativo</w:t>
+              <w:t>Flutter, PostgreSQL</w:t>
             </w:r>
           </w:p>
         </w:tc>
@@ -7558,7 +7574,7 @@
               <w:rPr>
                 <w:sz w:val="20"/>
               </w:rPr>
-              <w:t>Semana 15</w:t>
+              <w:t>Semana 14</w:t>
             </w:r>
           </w:p>
         </w:tc>
@@ -7586,7 +7602,7 @@
               <w:rPr>
                 <w:sz w:val="20"/>
               </w:rPr>
-              <w:t>Matías / Benjamín</w:t>
+              <w:t>Matías / Sergio</w:t>
             </w:r>
           </w:p>
         </w:tc>
@@ -7609,7 +7625,359 @@
               <w:rPr>
                 <w:sz w:val="20"/>
               </w:rPr>
-              <w:t>Facilitador: no requiere hardware adicional. Obstáculo: calibrar el umbral de sonido para evitar falsas alertas.</w:t>
+              <w:t>Facilitador: reutiliza el mismo patrón de registro manual ya construido. Obstáculo: ninguno relevante.</w:t>
+            </w:r>
+          </w:p>
+        </w:tc>
+      </w:tr>
+      <w:tr>
+        <w:trPr>
+          <w:cantSplit w:val="0"/>
+          <w:tblHeader w:val="0"/>
+        </w:trPr>
+        <w:tc>
+          <w:tcPr/>
+          <w:p>
+            <w:pPr>
+              <w:jc w:val="left"/>
+              <w:rPr>
+                <w:rFonts w:ascii="Calibri" w:cs="Calibri" w:eastAsia="Calibri" w:hAnsi="Calibri"/>
+                <w:i w:val="1"/>
+                <w:iCs w:val="1"/>
+                <w:color w:val="548dd4"/>
+                <w:sz w:val="18"/>
+                <w:szCs w:val="18"/>
+              </w:rPr>
+            </w:pPr>
+            <w:r/>
+            <w:r>
+              <w:rPr>
+                <w:sz w:val="20"/>
+              </w:rPr>
+              <w:t>C4</w:t>
+            </w:r>
+          </w:p>
+        </w:tc>
+        <w:tc>
+          <w:tcPr/>
+          <w:p>
+            <w:pPr>
+              <w:jc w:val="left"/>
+              <w:rPr>
+                <w:rFonts w:ascii="Calibri" w:cs="Calibri" w:eastAsia="Calibri" w:hAnsi="Calibri"/>
+                <w:i w:val="1"/>
+                <w:iCs w:val="1"/>
+                <w:color w:val="548dd4"/>
+                <w:sz w:val="18"/>
+                <w:szCs w:val="18"/>
+              </w:rPr>
+            </w:pPr>
+            <w:r/>
+            <w:r>
+              <w:rPr>
+                <w:sz w:val="20"/>
+              </w:rPr>
+              <w:t>Recordatorios extendidos</w:t>
+            </w:r>
+          </w:p>
+        </w:tc>
+        <w:tc>
+          <w:tcPr/>
+          <w:p>
+            <w:pPr>
+              <w:jc w:val="left"/>
+              <w:rPr>
+                <w:rFonts w:ascii="Calibri" w:cs="Calibri" w:eastAsia="Calibri" w:hAnsi="Calibri"/>
+                <w:i w:val="1"/>
+                <w:iCs w:val="1"/>
+                <w:color w:val="548dd4"/>
+                <w:sz w:val="18"/>
+                <w:szCs w:val="18"/>
+              </w:rPr>
+            </w:pPr>
+            <w:r/>
+            <w:r>
+              <w:rPr>
+                <w:sz w:val="20"/>
+              </w:rPr>
+              <w:t>Recordatorios para indicaciones post-consulta médica y citas médicas pendientes, con aviso diario hasta la fecha.</w:t>
+            </w:r>
+          </w:p>
+        </w:tc>
+        <w:tc>
+          <w:tcPr/>
+          <w:p>
+            <w:pPr>
+              <w:jc w:val="left"/>
+              <w:rPr>
+                <w:rFonts w:ascii="Calibri" w:cs="Calibri" w:eastAsia="Calibri" w:hAnsi="Calibri"/>
+                <w:i w:val="1"/>
+                <w:iCs w:val="1"/>
+                <w:color w:val="548dd4"/>
+                <w:sz w:val="18"/>
+                <w:szCs w:val="18"/>
+              </w:rPr>
+            </w:pPr>
+            <w:r/>
+            <w:r>
+              <w:rPr>
+                <w:sz w:val="20"/>
+              </w:rPr>
+              <w:t>FastAPI, PostgreSQL</w:t>
+            </w:r>
+          </w:p>
+        </w:tc>
+        <w:tc>
+          <w:tcPr>
+            <w:tcBorders>
+              <w:right w:color="ffffff" w:space="0" w:sz="4" w:val="single"/>
+            </w:tcBorders>
+          </w:tcPr>
+          <w:p>
+            <w:pPr>
+              <w:jc w:val="left"/>
+              <w:rPr>
+                <w:rFonts w:ascii="Calibri" w:cs="Calibri" w:eastAsia="Calibri" w:hAnsi="Calibri"/>
+                <w:i w:val="1"/>
+                <w:iCs w:val="1"/>
+                <w:color w:val="548dd4"/>
+                <w:sz w:val="18"/>
+                <w:szCs w:val="18"/>
+              </w:rPr>
+            </w:pPr>
+            <w:r/>
+            <w:r>
+              <w:rPr>
+                <w:sz w:val="20"/>
+              </w:rPr>
+              <w:t>Semana 14</w:t>
+            </w:r>
+          </w:p>
+        </w:tc>
+        <w:tc>
+          <w:tcPr>
+            <w:tcBorders>
+              <w:left w:color="ffffff" w:space="0" w:sz="4" w:val="single"/>
+            </w:tcBorders>
+            <w:shd w:fill="d9d9d9" w:val="clear"/>
+          </w:tcPr>
+          <w:p>
+            <w:pPr>
+              <w:jc w:val="left"/>
+              <w:rPr>
+                <w:rFonts w:ascii="Calibri" w:cs="Calibri" w:eastAsia="Calibri" w:hAnsi="Calibri"/>
+                <w:i w:val="1"/>
+                <w:iCs w:val="1"/>
+                <w:color w:val="548dd4"/>
+                <w:sz w:val="18"/>
+                <w:szCs w:val="18"/>
+              </w:rPr>
+            </w:pPr>
+            <w:r/>
+            <w:r>
+              <w:rPr>
+                <w:sz w:val="20"/>
+              </w:rPr>
+              <w:t>Benjamín</w:t>
+            </w:r>
+          </w:p>
+        </w:tc>
+        <w:tc>
+          <w:tcPr/>
+          <w:p>
+            <w:pPr>
+              <w:jc w:val="left"/>
+              <w:rPr>
+                <w:rFonts w:ascii="Calibri" w:cs="Calibri" w:eastAsia="Calibri" w:hAnsi="Calibri"/>
+                <w:i w:val="1"/>
+                <w:iCs w:val="1"/>
+                <w:color w:val="548dd4"/>
+                <w:sz w:val="18"/>
+                <w:szCs w:val="18"/>
+              </w:rPr>
+            </w:pPr>
+            <w:r/>
+            <w:r>
+              <w:rPr>
+                <w:sz w:val="20"/>
+              </w:rPr>
+              <w:t>Facilitador: extiende el motor de recordatorios existente. Obstáculo: modelar recordatorios con vigencia limitada.</w:t>
+            </w:r>
+          </w:p>
+        </w:tc>
+      </w:tr>
+      <w:tr>
+        <w:trPr>
+          <w:cantSplit w:val="0"/>
+          <w:tblHeader w:val="0"/>
+        </w:trPr>
+        <w:tc>
+          <w:tcPr/>
+          <w:p>
+            <w:pPr>
+              <w:jc w:val="left"/>
+              <w:rPr>
+                <w:rFonts w:ascii="Calibri" w:cs="Calibri" w:eastAsia="Calibri" w:hAnsi="Calibri"/>
+                <w:i w:val="1"/>
+                <w:iCs w:val="1"/>
+                <w:color w:val="548dd4"/>
+                <w:sz w:val="18"/>
+                <w:szCs w:val="18"/>
+              </w:rPr>
+            </w:pPr>
+            <w:r/>
+            <w:r>
+              <w:rPr>
+                <w:sz w:val="20"/>
+              </w:rPr>
+              <w:t>C4</w:t>
+            </w:r>
+          </w:p>
+        </w:tc>
+        <w:tc>
+          <w:tcPr/>
+          <w:p>
+            <w:pPr>
+              <w:jc w:val="left"/>
+              <w:rPr>
+                <w:rFonts w:ascii="Calibri" w:cs="Calibri" w:eastAsia="Calibri" w:hAnsi="Calibri"/>
+                <w:i w:val="1"/>
+                <w:iCs w:val="1"/>
+                <w:color w:val="548dd4"/>
+                <w:sz w:val="18"/>
+                <w:szCs w:val="18"/>
+              </w:rPr>
+            </w:pPr>
+            <w:r/>
+            <w:r>
+              <w:rPr>
+                <w:sz w:val="20"/>
+              </w:rPr>
+              <w:t>Farmacias cercanas vía IA</w:t>
+            </w:r>
+          </w:p>
+        </w:tc>
+        <w:tc>
+          <w:tcPr/>
+          <w:p>
+            <w:pPr>
+              <w:jc w:val="left"/>
+              <w:rPr>
+                <w:rFonts w:ascii="Calibri" w:cs="Calibri" w:eastAsia="Calibri" w:hAnsi="Calibri"/>
+                <w:i w:val="1"/>
+                <w:iCs w:val="1"/>
+                <w:color w:val="548dd4"/>
+                <w:sz w:val="18"/>
+                <w:szCs w:val="18"/>
+              </w:rPr>
+            </w:pPr>
+            <w:r/>
+            <w:r>
+              <w:rPr>
+                <w:sz w:val="20"/>
+              </w:rPr>
+              <w:t>Consulta a la IA sobre disponibilidad y precio de un medicamento en farmacias cercanas, recomendando por precio y cercanía.</w:t>
+            </w:r>
+          </w:p>
+        </w:tc>
+        <w:tc>
+          <w:tcPr/>
+          <w:p>
+            <w:pPr>
+              <w:jc w:val="left"/>
+              <w:rPr>
+                <w:rFonts w:ascii="Calibri" w:cs="Calibri" w:eastAsia="Calibri" w:hAnsi="Calibri"/>
+                <w:i w:val="1"/>
+                <w:iCs w:val="1"/>
+                <w:color w:val="548dd4"/>
+                <w:sz w:val="18"/>
+                <w:szCs w:val="18"/>
+              </w:rPr>
+            </w:pPr>
+            <w:r/>
+            <w:r>
+              <w:rPr>
+                <w:sz w:val="20"/>
+              </w:rPr>
+              <w:t>API LLM, geolocalización</w:t>
+            </w:r>
+          </w:p>
+        </w:tc>
+        <w:tc>
+          <w:tcPr>
+            <w:tcBorders>
+              <w:right w:color="ffffff" w:space="0" w:sz="4" w:val="single"/>
+            </w:tcBorders>
+          </w:tcPr>
+          <w:p>
+            <w:pPr>
+              <w:jc w:val="left"/>
+              <w:rPr>
+                <w:rFonts w:ascii="Calibri" w:cs="Calibri" w:eastAsia="Calibri" w:hAnsi="Calibri"/>
+                <w:i w:val="1"/>
+                <w:iCs w:val="1"/>
+                <w:color w:val="548dd4"/>
+                <w:sz w:val="18"/>
+                <w:szCs w:val="18"/>
+              </w:rPr>
+            </w:pPr>
+            <w:r/>
+            <w:r>
+              <w:rPr>
+                <w:sz w:val="20"/>
+              </w:rPr>
+              <w:t>Semana 15</w:t>
+            </w:r>
+          </w:p>
+        </w:tc>
+        <w:tc>
+          <w:tcPr>
+            <w:tcBorders>
+              <w:left w:color="ffffff" w:space="0" w:sz="4" w:val="single"/>
+            </w:tcBorders>
+            <w:shd w:fill="d9d9d9" w:val="clear"/>
+          </w:tcPr>
+          <w:p>
+            <w:pPr>
+              <w:jc w:val="left"/>
+              <w:rPr>
+                <w:rFonts w:ascii="Calibri" w:cs="Calibri" w:eastAsia="Calibri" w:hAnsi="Calibri"/>
+                <w:i w:val="1"/>
+                <w:iCs w:val="1"/>
+                <w:color w:val="548dd4"/>
+                <w:sz w:val="18"/>
+                <w:szCs w:val="18"/>
+              </w:rPr>
+            </w:pPr>
+            <w:r/>
+            <w:r>
+              <w:rPr>
+                <w:sz w:val="20"/>
+              </w:rPr>
+              <w:t>Sergio / Benjamín</w:t>
+            </w:r>
+          </w:p>
+        </w:tc>
+        <w:tc>
+          <w:tcPr/>
+          <w:p>
+            <w:pPr>
+              <w:jc w:val="left"/>
+              <w:rPr>
+                <w:rFonts w:ascii="Calibri" w:cs="Calibri" w:eastAsia="Calibri" w:hAnsi="Calibri"/>
+                <w:i w:val="1"/>
+                <w:iCs w:val="1"/>
+                <w:color w:val="548dd4"/>
+                <w:sz w:val="18"/>
+                <w:szCs w:val="18"/>
+              </w:rPr>
+            </w:pPr>
+            <w:r/>
+            <w:r>
+              <w:rPr>
+                <w:sz w:val="20"/>
+              </w:rPr>
+              <w:t>Facilitador: se apoya en datos públicos de referencia (ej. TuFarmacia.gob.cl). Obstáculo: acotar el alcance si falta tiempo.</w:t>
             </w:r>
           </w:p>
         </w:tc>
@@ -12741,7 +13109,7 @@
               <w:rPr>
                 <w:sz w:val="20"/>
               </w:rPr>
-              <w:t>Modo pantalla en casa (tablet)</w:t>
+              <w:t>Pulsera: ubicación y salud</w:t>
             </w:r>
           </w:p>
         </w:tc>
@@ -13037,7 +13405,6 @@
               <w:rPr>
                 <w:sz w:val="20"/>
               </w:rPr>
-              <w:t>X</w:t>
             </w:r>
           </w:p>
         </w:tc>
@@ -13152,7 +13519,7 @@
               <w:rPr>
                 <w:sz w:val="20"/>
               </w:rPr>
-              <w:t>Integración con pulsera inteligente</w:t>
+              <w:t>Pulsera: funciones de seguridad</w:t>
             </w:r>
           </w:p>
         </w:tc>
@@ -13426,6 +13793,7 @@
               <w:rPr>
                 <w:sz w:val="20"/>
               </w:rPr>
+              <w:t>X</w:t>
             </w:r>
           </w:p>
         </w:tc>
@@ -13447,7 +13815,6 @@
               <w:rPr>
                 <w:sz w:val="20"/>
               </w:rPr>
-              <w:t>X</w:t>
             </w:r>
           </w:p>
         </w:tc>
@@ -13562,7 +13929,827 @@
               <w:rPr>
                 <w:sz w:val="20"/>
               </w:rPr>
-              <w:t>Detección de ruido fuerte</w:t>
+              <w:t>Registro manual de glucosa</w:t>
+            </w:r>
+          </w:p>
+        </w:tc>
+        <w:tc>
+          <w:tcPr/>
+          <w:p>
+            <w:pPr>
+              <w:spacing w:line="360" w:lineRule="auto"/>
+              <w:jc w:val="left"/>
+              <w:rPr>
+                <w:b w:val="1"/>
+                <w:bCs w:val="1"/>
+                <w:sz w:val="16"/>
+                <w:szCs w:val="16"/>
+              </w:rPr>
+            </w:pPr>
+            <w:r/>
+            <w:r>
+              <w:rPr>
+                <w:sz w:val="20"/>
+              </w:rPr>
+            </w:r>
+          </w:p>
+        </w:tc>
+        <w:tc>
+          <w:tcPr/>
+          <w:p>
+            <w:pPr>
+              <w:spacing w:line="360" w:lineRule="auto"/>
+              <w:jc w:val="left"/>
+              <w:rPr>
+                <w:b w:val="1"/>
+                <w:bCs w:val="1"/>
+                <w:sz w:val="16"/>
+                <w:szCs w:val="16"/>
+              </w:rPr>
+            </w:pPr>
+            <w:r/>
+            <w:r>
+              <w:rPr>
+                <w:sz w:val="20"/>
+              </w:rPr>
+            </w:r>
+          </w:p>
+        </w:tc>
+        <w:tc>
+          <w:tcPr/>
+          <w:p>
+            <w:pPr>
+              <w:spacing w:line="360" w:lineRule="auto"/>
+              <w:jc w:val="left"/>
+              <w:rPr>
+                <w:b w:val="1"/>
+                <w:bCs w:val="1"/>
+                <w:sz w:val="16"/>
+                <w:szCs w:val="16"/>
+              </w:rPr>
+            </w:pPr>
+            <w:r/>
+            <w:r>
+              <w:rPr>
+                <w:sz w:val="20"/>
+              </w:rPr>
+            </w:r>
+          </w:p>
+        </w:tc>
+        <w:tc>
+          <w:tcPr/>
+          <w:p>
+            <w:pPr>
+              <w:spacing w:line="360" w:lineRule="auto"/>
+              <w:jc w:val="left"/>
+              <w:rPr>
+                <w:b w:val="1"/>
+                <w:bCs w:val="1"/>
+                <w:sz w:val="16"/>
+                <w:szCs w:val="16"/>
+              </w:rPr>
+            </w:pPr>
+            <w:r/>
+            <w:r>
+              <w:rPr>
+                <w:sz w:val="20"/>
+              </w:rPr>
+            </w:r>
+          </w:p>
+        </w:tc>
+        <w:tc>
+          <w:tcPr/>
+          <w:p>
+            <w:pPr>
+              <w:spacing w:line="360" w:lineRule="auto"/>
+              <w:jc w:val="left"/>
+              <w:rPr>
+                <w:b w:val="1"/>
+                <w:bCs w:val="1"/>
+                <w:sz w:val="16"/>
+                <w:szCs w:val="16"/>
+              </w:rPr>
+            </w:pPr>
+            <w:r/>
+            <w:r>
+              <w:rPr>
+                <w:sz w:val="20"/>
+              </w:rPr>
+            </w:r>
+          </w:p>
+        </w:tc>
+        <w:tc>
+          <w:tcPr/>
+          <w:p>
+            <w:pPr>
+              <w:spacing w:line="360" w:lineRule="auto"/>
+              <w:jc w:val="left"/>
+              <w:rPr>
+                <w:b w:val="1"/>
+                <w:bCs w:val="1"/>
+                <w:sz w:val="16"/>
+                <w:szCs w:val="16"/>
+              </w:rPr>
+            </w:pPr>
+            <w:r/>
+            <w:r>
+              <w:rPr>
+                <w:sz w:val="20"/>
+              </w:rPr>
+            </w:r>
+          </w:p>
+        </w:tc>
+        <w:tc>
+          <w:tcPr/>
+          <w:p>
+            <w:pPr>
+              <w:spacing w:line="360" w:lineRule="auto"/>
+              <w:jc w:val="left"/>
+              <w:rPr>
+                <w:b w:val="1"/>
+                <w:bCs w:val="1"/>
+                <w:sz w:val="16"/>
+                <w:szCs w:val="16"/>
+              </w:rPr>
+            </w:pPr>
+            <w:r/>
+            <w:r>
+              <w:rPr>
+                <w:sz w:val="20"/>
+              </w:rPr>
+            </w:r>
+          </w:p>
+        </w:tc>
+        <w:tc>
+          <w:tcPr/>
+          <w:p>
+            <w:pPr>
+              <w:spacing w:line="360" w:lineRule="auto"/>
+              <w:jc w:val="left"/>
+              <w:rPr>
+                <w:b w:val="1"/>
+                <w:bCs w:val="1"/>
+                <w:sz w:val="16"/>
+                <w:szCs w:val="16"/>
+              </w:rPr>
+            </w:pPr>
+            <w:r/>
+            <w:r>
+              <w:rPr>
+                <w:sz w:val="20"/>
+              </w:rPr>
+            </w:r>
+          </w:p>
+        </w:tc>
+        <w:tc>
+          <w:tcPr/>
+          <w:p>
+            <w:pPr>
+              <w:spacing w:line="360" w:lineRule="auto"/>
+              <w:jc w:val="left"/>
+              <w:rPr>
+                <w:b w:val="1"/>
+                <w:bCs w:val="1"/>
+                <w:sz w:val="16"/>
+                <w:szCs w:val="16"/>
+              </w:rPr>
+            </w:pPr>
+            <w:r/>
+            <w:r>
+              <w:rPr>
+                <w:sz w:val="20"/>
+              </w:rPr>
+            </w:r>
+          </w:p>
+        </w:tc>
+        <w:tc>
+          <w:tcPr/>
+          <w:p>
+            <w:pPr>
+              <w:spacing w:line="360" w:lineRule="auto"/>
+              <w:jc w:val="left"/>
+              <w:rPr>
+                <w:b w:val="1"/>
+                <w:bCs w:val="1"/>
+                <w:sz w:val="16"/>
+                <w:szCs w:val="16"/>
+              </w:rPr>
+            </w:pPr>
+            <w:r/>
+            <w:r>
+              <w:rPr>
+                <w:sz w:val="20"/>
+              </w:rPr>
+            </w:r>
+          </w:p>
+        </w:tc>
+        <w:tc>
+          <w:tcPr/>
+          <w:p>
+            <w:pPr>
+              <w:spacing w:line="360" w:lineRule="auto"/>
+              <w:jc w:val="left"/>
+              <w:rPr>
+                <w:b w:val="1"/>
+                <w:bCs w:val="1"/>
+                <w:sz w:val="16"/>
+                <w:szCs w:val="16"/>
+              </w:rPr>
+            </w:pPr>
+            <w:r/>
+            <w:r>
+              <w:rPr>
+                <w:sz w:val="20"/>
+              </w:rPr>
+            </w:r>
+          </w:p>
+        </w:tc>
+        <w:tc>
+          <w:tcPr/>
+          <w:p>
+            <w:pPr>
+              <w:spacing w:line="360" w:lineRule="auto"/>
+              <w:jc w:val="left"/>
+              <w:rPr>
+                <w:b w:val="1"/>
+                <w:bCs w:val="1"/>
+                <w:sz w:val="16"/>
+                <w:szCs w:val="16"/>
+              </w:rPr>
+            </w:pPr>
+            <w:r/>
+            <w:r>
+              <w:rPr>
+                <w:sz w:val="20"/>
+              </w:rPr>
+            </w:r>
+          </w:p>
+        </w:tc>
+        <w:tc>
+          <w:tcPr/>
+          <w:p>
+            <w:pPr>
+              <w:spacing w:line="360" w:lineRule="auto"/>
+              <w:jc w:val="left"/>
+              <w:rPr>
+                <w:b w:val="1"/>
+                <w:bCs w:val="1"/>
+                <w:sz w:val="16"/>
+                <w:szCs w:val="16"/>
+              </w:rPr>
+            </w:pPr>
+            <w:r/>
+            <w:r>
+              <w:rPr>
+                <w:sz w:val="20"/>
+              </w:rPr>
+            </w:r>
+          </w:p>
+        </w:tc>
+        <w:tc>
+          <w:tcPr/>
+          <w:p>
+            <w:pPr>
+              <w:spacing w:line="360" w:lineRule="auto"/>
+              <w:jc w:val="left"/>
+              <w:rPr>
+                <w:b w:val="1"/>
+                <w:bCs w:val="1"/>
+                <w:sz w:val="16"/>
+                <w:szCs w:val="16"/>
+              </w:rPr>
+            </w:pPr>
+            <w:r/>
+            <w:r>
+              <w:rPr>
+                <w:sz w:val="20"/>
+              </w:rPr>
+              <w:t>X</w:t>
+            </w:r>
+          </w:p>
+        </w:tc>
+        <w:tc>
+          <w:tcPr/>
+          <w:p>
+            <w:pPr>
+              <w:spacing w:line="360" w:lineRule="auto"/>
+              <w:jc w:val="left"/>
+              <w:rPr>
+                <w:b w:val="1"/>
+                <w:bCs w:val="1"/>
+                <w:sz w:val="16"/>
+                <w:szCs w:val="16"/>
+              </w:rPr>
+            </w:pPr>
+            <w:r/>
+            <w:r>
+              <w:rPr>
+                <w:sz w:val="20"/>
+              </w:rPr>
+            </w:r>
+          </w:p>
+        </w:tc>
+        <w:tc>
+          <w:tcPr>
+            <w:gridSpan w:val="2"/>
+          </w:tcPr>
+          <w:p>
+            <w:pPr>
+              <w:spacing w:line="360" w:lineRule="auto"/>
+              <w:jc w:val="left"/>
+              <w:rPr>
+                <w:b w:val="1"/>
+                <w:bCs w:val="1"/>
+                <w:sz w:val="16"/>
+                <w:szCs w:val="16"/>
+              </w:rPr>
+            </w:pPr>
+            <w:r/>
+            <w:r>
+              <w:rPr>
+                <w:sz w:val="20"/>
+              </w:rPr>
+            </w:r>
+          </w:p>
+        </w:tc>
+        <w:tc>
+          <w:tcPr/>
+          <w:p>
+            <w:pPr>
+              <w:spacing w:line="360" w:lineRule="auto"/>
+              <w:jc w:val="left"/>
+              <w:rPr>
+                <w:b w:val="1"/>
+                <w:bCs w:val="1"/>
+                <w:sz w:val="16"/>
+                <w:szCs w:val="16"/>
+              </w:rPr>
+            </w:pPr>
+            <w:r/>
+            <w:r>
+              <w:rPr>
+                <w:sz w:val="20"/>
+              </w:rPr>
+            </w:r>
+          </w:p>
+        </w:tc>
+        <w:tc>
+          <w:tcPr/>
+          <w:p>
+            <w:pPr>
+              <w:spacing w:line="360" w:lineRule="auto"/>
+              <w:jc w:val="left"/>
+              <w:rPr>
+                <w:b w:val="1"/>
+                <w:bCs w:val="1"/>
+                <w:sz w:val="16"/>
+                <w:szCs w:val="16"/>
+              </w:rPr>
+            </w:pPr>
+            <w:r/>
+            <w:r>
+              <w:rPr>
+                <w:sz w:val="20"/>
+              </w:rPr>
+            </w:r>
+          </w:p>
+        </w:tc>
+      </w:tr>
+      <w:tr>
+        <w:trPr>
+          <w:cantSplit w:val="0"/>
+          <w:trHeight w:val="294" w:hRule="atLeast"/>
+          <w:tblHeader w:val="0"/>
+        </w:trPr>
+        <w:tc>
+          <w:tcPr/>
+          <w:p>
+            <w:pPr>
+              <w:spacing w:line="360" w:lineRule="auto"/>
+              <w:jc w:val="left"/>
+              <w:rPr>
+                <w:b w:val="1"/>
+                <w:bCs w:val="1"/>
+                <w:sz w:val="16"/>
+                <w:szCs w:val="16"/>
+              </w:rPr>
+            </w:pPr>
+            <w:r/>
+            <w:r>
+              <w:rPr>
+                <w:sz w:val="20"/>
+              </w:rPr>
+              <w:t>Recordatorios extendidos</w:t>
+            </w:r>
+          </w:p>
+        </w:tc>
+        <w:tc>
+          <w:tcPr/>
+          <w:p>
+            <w:pPr>
+              <w:spacing w:line="360" w:lineRule="auto"/>
+              <w:jc w:val="left"/>
+              <w:rPr>
+                <w:b w:val="1"/>
+                <w:bCs w:val="1"/>
+                <w:sz w:val="16"/>
+                <w:szCs w:val="16"/>
+              </w:rPr>
+            </w:pPr>
+            <w:r/>
+            <w:r>
+              <w:rPr>
+                <w:sz w:val="20"/>
+              </w:rPr>
+            </w:r>
+          </w:p>
+        </w:tc>
+        <w:tc>
+          <w:tcPr/>
+          <w:p>
+            <w:pPr>
+              <w:spacing w:line="360" w:lineRule="auto"/>
+              <w:jc w:val="left"/>
+              <w:rPr>
+                <w:b w:val="1"/>
+                <w:bCs w:val="1"/>
+                <w:sz w:val="16"/>
+                <w:szCs w:val="16"/>
+              </w:rPr>
+            </w:pPr>
+            <w:r/>
+            <w:r>
+              <w:rPr>
+                <w:sz w:val="20"/>
+              </w:rPr>
+            </w:r>
+          </w:p>
+        </w:tc>
+        <w:tc>
+          <w:tcPr/>
+          <w:p>
+            <w:pPr>
+              <w:spacing w:line="360" w:lineRule="auto"/>
+              <w:jc w:val="left"/>
+              <w:rPr>
+                <w:b w:val="1"/>
+                <w:bCs w:val="1"/>
+                <w:sz w:val="16"/>
+                <w:szCs w:val="16"/>
+              </w:rPr>
+            </w:pPr>
+            <w:r/>
+            <w:r>
+              <w:rPr>
+                <w:sz w:val="20"/>
+              </w:rPr>
+            </w:r>
+          </w:p>
+        </w:tc>
+        <w:tc>
+          <w:tcPr/>
+          <w:p>
+            <w:pPr>
+              <w:spacing w:line="360" w:lineRule="auto"/>
+              <w:jc w:val="left"/>
+              <w:rPr>
+                <w:b w:val="1"/>
+                <w:bCs w:val="1"/>
+                <w:sz w:val="16"/>
+                <w:szCs w:val="16"/>
+              </w:rPr>
+            </w:pPr>
+            <w:r/>
+            <w:r>
+              <w:rPr>
+                <w:sz w:val="20"/>
+              </w:rPr>
+            </w:r>
+          </w:p>
+        </w:tc>
+        <w:tc>
+          <w:tcPr/>
+          <w:p>
+            <w:pPr>
+              <w:spacing w:line="360" w:lineRule="auto"/>
+              <w:jc w:val="left"/>
+              <w:rPr>
+                <w:b w:val="1"/>
+                <w:bCs w:val="1"/>
+                <w:sz w:val="16"/>
+                <w:szCs w:val="16"/>
+              </w:rPr>
+            </w:pPr>
+            <w:r/>
+            <w:r>
+              <w:rPr>
+                <w:sz w:val="20"/>
+              </w:rPr>
+            </w:r>
+          </w:p>
+        </w:tc>
+        <w:tc>
+          <w:tcPr/>
+          <w:p>
+            <w:pPr>
+              <w:spacing w:line="360" w:lineRule="auto"/>
+              <w:jc w:val="left"/>
+              <w:rPr>
+                <w:b w:val="1"/>
+                <w:bCs w:val="1"/>
+                <w:sz w:val="16"/>
+                <w:szCs w:val="16"/>
+              </w:rPr>
+            </w:pPr>
+            <w:r/>
+            <w:r>
+              <w:rPr>
+                <w:sz w:val="20"/>
+              </w:rPr>
+            </w:r>
+          </w:p>
+        </w:tc>
+        <w:tc>
+          <w:tcPr/>
+          <w:p>
+            <w:pPr>
+              <w:spacing w:line="360" w:lineRule="auto"/>
+              <w:jc w:val="left"/>
+              <w:rPr>
+                <w:b w:val="1"/>
+                <w:bCs w:val="1"/>
+                <w:sz w:val="16"/>
+                <w:szCs w:val="16"/>
+              </w:rPr>
+            </w:pPr>
+            <w:r/>
+            <w:r>
+              <w:rPr>
+                <w:sz w:val="20"/>
+              </w:rPr>
+            </w:r>
+          </w:p>
+        </w:tc>
+        <w:tc>
+          <w:tcPr/>
+          <w:p>
+            <w:pPr>
+              <w:spacing w:line="360" w:lineRule="auto"/>
+              <w:jc w:val="left"/>
+              <w:rPr>
+                <w:b w:val="1"/>
+                <w:bCs w:val="1"/>
+                <w:sz w:val="16"/>
+                <w:szCs w:val="16"/>
+              </w:rPr>
+            </w:pPr>
+            <w:r/>
+            <w:r>
+              <w:rPr>
+                <w:sz w:val="20"/>
+              </w:rPr>
+            </w:r>
+          </w:p>
+        </w:tc>
+        <w:tc>
+          <w:tcPr/>
+          <w:p>
+            <w:pPr>
+              <w:spacing w:line="360" w:lineRule="auto"/>
+              <w:jc w:val="left"/>
+              <w:rPr>
+                <w:b w:val="1"/>
+                <w:bCs w:val="1"/>
+                <w:sz w:val="16"/>
+                <w:szCs w:val="16"/>
+              </w:rPr>
+            </w:pPr>
+            <w:r/>
+            <w:r>
+              <w:rPr>
+                <w:sz w:val="20"/>
+              </w:rPr>
+            </w:r>
+          </w:p>
+        </w:tc>
+        <w:tc>
+          <w:tcPr/>
+          <w:p>
+            <w:pPr>
+              <w:spacing w:line="360" w:lineRule="auto"/>
+              <w:jc w:val="left"/>
+              <w:rPr>
+                <w:b w:val="1"/>
+                <w:bCs w:val="1"/>
+                <w:sz w:val="16"/>
+                <w:szCs w:val="16"/>
+              </w:rPr>
+            </w:pPr>
+            <w:r/>
+            <w:r>
+              <w:rPr>
+                <w:sz w:val="20"/>
+              </w:rPr>
+            </w:r>
+          </w:p>
+        </w:tc>
+        <w:tc>
+          <w:tcPr/>
+          <w:p>
+            <w:pPr>
+              <w:spacing w:line="360" w:lineRule="auto"/>
+              <w:jc w:val="left"/>
+              <w:rPr>
+                <w:b w:val="1"/>
+                <w:bCs w:val="1"/>
+                <w:sz w:val="16"/>
+                <w:szCs w:val="16"/>
+              </w:rPr>
+            </w:pPr>
+            <w:r/>
+            <w:r>
+              <w:rPr>
+                <w:sz w:val="20"/>
+              </w:rPr>
+            </w:r>
+          </w:p>
+        </w:tc>
+        <w:tc>
+          <w:tcPr/>
+          <w:p>
+            <w:pPr>
+              <w:spacing w:line="360" w:lineRule="auto"/>
+              <w:jc w:val="left"/>
+              <w:rPr>
+                <w:b w:val="1"/>
+                <w:bCs w:val="1"/>
+                <w:sz w:val="16"/>
+                <w:szCs w:val="16"/>
+              </w:rPr>
+            </w:pPr>
+            <w:r/>
+            <w:r>
+              <w:rPr>
+                <w:sz w:val="20"/>
+              </w:rPr>
+            </w:r>
+          </w:p>
+        </w:tc>
+        <w:tc>
+          <w:tcPr/>
+          <w:p>
+            <w:pPr>
+              <w:spacing w:line="360" w:lineRule="auto"/>
+              <w:jc w:val="left"/>
+              <w:rPr>
+                <w:b w:val="1"/>
+                <w:bCs w:val="1"/>
+                <w:sz w:val="16"/>
+                <w:szCs w:val="16"/>
+              </w:rPr>
+            </w:pPr>
+            <w:r/>
+            <w:r>
+              <w:rPr>
+                <w:sz w:val="20"/>
+              </w:rPr>
+            </w:r>
+          </w:p>
+        </w:tc>
+        <w:tc>
+          <w:tcPr/>
+          <w:p>
+            <w:pPr>
+              <w:spacing w:line="360" w:lineRule="auto"/>
+              <w:jc w:val="left"/>
+              <w:rPr>
+                <w:b w:val="1"/>
+                <w:bCs w:val="1"/>
+                <w:sz w:val="16"/>
+                <w:szCs w:val="16"/>
+              </w:rPr>
+            </w:pPr>
+            <w:r/>
+            <w:r>
+              <w:rPr>
+                <w:sz w:val="20"/>
+              </w:rPr>
+              <w:t>X</w:t>
+            </w:r>
+          </w:p>
+        </w:tc>
+        <w:tc>
+          <w:tcPr/>
+          <w:p>
+            <w:pPr>
+              <w:spacing w:line="360" w:lineRule="auto"/>
+              <w:jc w:val="left"/>
+              <w:rPr>
+                <w:b w:val="1"/>
+                <w:bCs w:val="1"/>
+                <w:sz w:val="16"/>
+                <w:szCs w:val="16"/>
+              </w:rPr>
+            </w:pPr>
+            <w:r/>
+            <w:r>
+              <w:rPr>
+                <w:sz w:val="20"/>
+              </w:rPr>
+            </w:r>
+          </w:p>
+        </w:tc>
+        <w:tc>
+          <w:tcPr>
+            <w:gridSpan w:val="2"/>
+          </w:tcPr>
+          <w:p>
+            <w:pPr>
+              <w:spacing w:line="360" w:lineRule="auto"/>
+              <w:jc w:val="left"/>
+              <w:rPr>
+                <w:b w:val="1"/>
+                <w:bCs w:val="1"/>
+                <w:sz w:val="16"/>
+                <w:szCs w:val="16"/>
+              </w:rPr>
+            </w:pPr>
+            <w:r/>
+            <w:r>
+              <w:rPr>
+                <w:sz w:val="20"/>
+              </w:rPr>
+            </w:r>
+          </w:p>
+        </w:tc>
+        <w:tc>
+          <w:tcPr/>
+          <w:p>
+            <w:pPr>
+              <w:spacing w:line="360" w:lineRule="auto"/>
+              <w:jc w:val="left"/>
+              <w:rPr>
+                <w:b w:val="1"/>
+                <w:bCs w:val="1"/>
+                <w:sz w:val="16"/>
+                <w:szCs w:val="16"/>
+              </w:rPr>
+            </w:pPr>
+            <w:r/>
+            <w:r>
+              <w:rPr>
+                <w:sz w:val="20"/>
+              </w:rPr>
+            </w:r>
+          </w:p>
+        </w:tc>
+        <w:tc>
+          <w:tcPr/>
+          <w:p>
+            <w:pPr>
+              <w:spacing w:line="360" w:lineRule="auto"/>
+              <w:jc w:val="left"/>
+              <w:rPr>
+                <w:b w:val="1"/>
+                <w:bCs w:val="1"/>
+                <w:sz w:val="16"/>
+                <w:szCs w:val="16"/>
+              </w:rPr>
+            </w:pPr>
+            <w:r/>
+            <w:r>
+              <w:rPr>
+                <w:sz w:val="20"/>
+              </w:rPr>
+            </w:r>
+          </w:p>
+        </w:tc>
+      </w:tr>
+      <w:tr>
+        <w:trPr>
+          <w:cantSplit w:val="0"/>
+          <w:trHeight w:val="294" w:hRule="atLeast"/>
+          <w:tblHeader w:val="0"/>
+        </w:trPr>
+        <w:tc>
+          <w:tcPr/>
+          <w:p>
+            <w:pPr>
+              <w:spacing w:line="360" w:lineRule="auto"/>
+              <w:jc w:val="left"/>
+              <w:rPr>
+                <w:b w:val="1"/>
+                <w:bCs w:val="1"/>
+                <w:sz w:val="16"/>
+                <w:szCs w:val="16"/>
+              </w:rPr>
+            </w:pPr>
+            <w:r/>
+            <w:r>
+              <w:rPr>
+                <w:sz w:val="20"/>
+              </w:rPr>
+              <w:t>Farmacias cercanas vía IA</w:t>
             </w:r>
           </w:p>
         </w:tc>

</xml_diff>

<commit_message>
Integra Traccar para GPS propio
</commit_message>
<xml_diff>
--- a/Fase 1/Evidencias Grupales/1.5_GuiaEstudiante_Fase1_DefinicionProyectoAPT_PerfilMedico.docx
+++ b/Fase 1/Evidencias Grupales/1.5_GuiaEstudiante_Fase1_DefinicionProyectoAPT_PerfilMedico.docx
@@ -1535,7 +1535,7 @@
                 <w:szCs w:val="22"/>
                 <w:rtl w:val="0"/>
               </w:rPr>
-              <w:t>Muchas familias gestionan las horas médicas, tratamientos, medicamentos, controles y antecedentes de salud de forma manual o repartida entre múltiples herramientas no integradas (papeles, fotografías de recetas, calendarios, WhatsApp, alarmas del teléfono). Esta dispersión genera desorganización, pérdida de información y dificulta el seguimiento adecuado de las indicaciones de salud, especialmente en adultos mayores, personas con enfermedades crónicas y personas que requieren apoyo permanente, así como en los familiares que cumplen el rol de cuidadores y no siempre pueden estar físicamente presentes. La situación se sitúa en el contexto de familias de la Región Metropolitana de Chile e impacta principalmente a adultos mayores, perfiles dependientes con enfermedades crónicas y a sus cuidadores.</w:t>
+              <w:t>Muchas familias gestionan las horas médicas, tratamientos, medicamentos, controles y antecedentes de salud de forma manual o repartida entre múltiples herramientas no integradas (papeles, fotografías de recetas, calendarios, WhatsApp, alarmas del teléfono). Esta dispersión genera desorganización, pérdida de información y dificulta el seguimiento adecuado de las indicaciones de salud, especialmente en adultos mayores, personas con enfermedades crónicas y personas que requieren apoyo permanente, así como en los familiares que cumplen el rol de cuidadores y no siempre pueden estar físicamente presentes. La situación se sitúa en el contexto de familias de la Región Metropolitana de Chile e impacta principalmente a adultos mayores, personas con enfermedades crónicas y a sus cuidadores.</w:t>
             </w:r>
             <w:r>
               <w:rPr>
@@ -1563,7 +1563,7 @@
               <w:rPr>
                 <w:sz w:val="22"/>
               </w:rPr>
-              <w:t>Se proyecta un modelo freemium: un plan Gratis (1 perfil, recordatorios básicos y confirmación manual) y un plan Perfil Médico+ Premium ($2.990-$3.990 CLP mensual o $24.990-$29.990 CLP anual) que desbloquea perfiles dependientes ilimitados, la pulsera inteligente conectada, alertas escalonadas al cuidador, historial completo y reportes para el médico, y el módulo de IA (orientación general y búsqueda de farmacias). El plan pagado se activa naturalmente en el momento de mayor necesidad percibida: cuando el usuario quiere agregar a un familiar a su cargo.</w:t>
+              <w:t>Se proyecta un modelo freemium: un plan Gratis (1 perfil, recordatorios básicos y confirmación manual) y un plan Perfil Médico+ Premium ($3.490 CLP mensual o $29.990 CLP anual por el primer perfil dependiente) que desbloquea perfiles dependientes, la pulsera inteligente conectada, alertas escalonadas al cuidador, historial completo y reportes para el médico, y el módulo de IA (orientación general y búsqueda de farmacias). Por cada perfil dependiente adicional que la misma cuenta agregue manteniendo el primero activo, se aplica un 5% de descuento sobre el valor de ese perfil extra (ej. segundo perfil: ~$3.315 CLP mensual), premiando a quien cuida de más de una persona sin encarecer el plan base. El precio se fijó buscando ser accesible para una familia chilena y a la vez permitir alcanzar rentabilidad en un plazo razonable, dado el bajo costo operativo del proyecto (APIs externas gratuitas como Health Connect, e infraestructura cloud económica para una base de usuarios inicial). El plan pagado se activa naturalmente en el momento de mayor necesidad percibida: cuando el usuario quiere agregar a un familiar a su cargo.</w:t>
             </w:r>
           </w:p>
         </w:tc>
@@ -1630,6 +1630,29 @@
                 <w:b/>
                 <w:sz w:val="22"/>
               </w:rPr>
+              <w:t>Tres interfaces distintas según quién la usa:</w:t>
+            </w:r>
+          </w:p>
+          <w:p>
+            <w:pPr>
+              <w:jc w:val="left"/>
+            </w:pPr>
+            <w:r>
+              <w:rPr>
+                <w:sz w:val="22"/>
+              </w:rPr>
+              <w:t>La app del titular/cuidador tiene una estructura completa (gestión de perfiles, alertas, historial, configuración); la vista de la app para el perfil dependiente (persona no valente) tiene una estructura distinta y simplificada, con botones grandes y solo acciones de confirmación, pensada para quien no necesariamente maneja un smartphone con fluidez; y la pulsera inteligente tiene su propia interfaz física, mínima, con un botón SOS y una pantalla básica de estado — independiente de la app.</w:t>
+            </w:r>
+          </w:p>
+          <w:p>
+            <w:pPr>
+              <w:jc w:val="left"/>
+            </w:pPr>
+            <w:r>
+              <w:rPr>
+                <w:b/>
+                <w:sz w:val="22"/>
+              </w:rPr>
               <w:t>Diferenciador: Pulsera Inteligente Perfil Médico+</w:t>
             </w:r>
           </w:p>
@@ -1967,7 +1990,7 @@
                 <w:b w:val="0"/>
                 <w:sz w:val="22"/>
               </w:rPr>
-              <w:t>La pulsera se integra vía Health Connect (API gratuita y oficial de Android) y el SDK/app del fabricante para GPS y funciones de seguridad; no requiere desarrollar hardware propio ni conocimientos de electrónica. Costo de referencia: $70.000-$90.000 CLP el dispositivo, más un plan SIM prepago (~$5.000-$10.000 CLP mensuales) para la transmisión de ubicación en tiempo real. El registro manual de glucosa, los recordatorios extendidos y la consulta de farmacias son funcionalidades 100% de software, sin costo de hardware adicional. Estas funcionalidades se plantean como incrementos sobre el MVP base, a priorizar en Fase 2 según el avance del equipo.</w:t>
+              <w:t>La pulsera se integra vía Health Connect (API gratuita y oficial de Android) para frecuencia cardíaca y presión referencial. Para el GPS y las funciones de seguridad (geocercas, caídas, SOS, batería, inactividad), en lugar de depender de la app cerrada del fabricante, el equipo levanta su propio servidor Traccar (plataforma de rastreo GPS gratuita y de código abierto, sobre Docker) que recibe los datos directo del dispositivo, y el backend FastAPI consulta la API REST de Traccar para mostrarlos dentro de la propia app. Esto requiere elegir modelos de pulsera confirmados con un protocolo abierto compatible (ej. GT06), verificado con una unidad de muestra antes de comprar el lote completo. No requiere desarrollar hardware propio ni conocimientos de electrónica. Costo de referencia: $70.000-$90.000 CLP el dispositivo, más un plan SIM prepago (~$5.000-$10.000 CLP mensuales) para la transmisión de ubicación en tiempo real. El registro manual de glucosa, los recordatorios extendidos y la consulta de farmacias son funcionalidades 100% de software, sin costo de hardware adicional. Estas funcionalidades se plantean como incrementos sobre el MVP base, a priorizar en Fase 2 según el avance del equipo.</w:t>
             </w:r>
           </w:p>
         </w:tc>
@@ -7172,7 +7195,7 @@
               <w:rPr>
                 <w:sz w:val="20"/>
               </w:rPr>
-              <w:t>Integración de la pulsera inteligente vía GPS y Health Connect: geocercas, frecuencia cardíaca y presión referencial en el perfil.</w:t>
+              <w:t>Levantar servidor Traccar (Docker) para recibir GPS/geocercas directo del dispositivo, y consumir su API REST desde el backend junto con Health Connect para frecuencia cardíaca y presión referencial.</w:t>
             </w:r>
           </w:p>
         </w:tc>
@@ -7195,7 +7218,7 @@
               <w:rPr>
                 <w:sz w:val="20"/>
               </w:rPr>
-              <w:t>Health Connect API, SDK pulsera GPS</w:t>
+              <w:t>Health Connect API, servidor Traccar (Docker), SDK pulsera GPS</w:t>
             </w:r>
           </w:p>
         </w:tc>
@@ -7273,7 +7296,7 @@
               <w:rPr>
                 <w:sz w:val="20"/>
               </w:rPr>
-              <w:t>Facilitador: Health Connect ya validado en Fase 1. Obstáculo: primera integración con un dispositivo GPS externo.</w:t>
+              <w:t>Facilitador: Traccar y Health Connect ya validados en Fase 1. Obstáculo: confirmar que el modelo de pulsera comprado usa un protocolo compatible (ej. GT06).</w:t>
             </w:r>
           </w:p>
         </w:tc>

</xml_diff>